<commit_message>
Bloques de código con \`\`\`: recuadro literal que conserva la sangría
</commit_message>
<xml_diff>
--- a/ejemplo.docx
+++ b/ejemplo.docx
@@ -821,7 +821,7 @@
         <w:pageBreakBefore w:val="0"/>
         <w:numPr>
           <w:ilvl w:val="0"/>
-          <w:numId w:val="92"/>
+          <w:numId w:val="7"/>
         </w:numPr>
         <w:spacing w:before="240" w:line="276" w:lineRule="auto"/>
         <w:outlineLvl w:val="1"/>
@@ -1206,7 +1206,7 @@
         <w:pageBreakBefore w:val="0"/>
         <w:numPr>
           <w:ilvl w:val="1"/>
-          <w:numId w:val="92"/>
+          <w:numId w:val="7"/>
         </w:numPr>
         <w:spacing w:after="60" w:line="264" w:lineRule="auto"/>
         <w:outlineLvl w:val="2"/>
@@ -1250,7 +1250,7 @@
         <w:pageBreakBefore w:val="0"/>
         <w:numPr>
           <w:ilvl w:val="0"/>
-          <w:numId w:val="92"/>
+          <w:numId w:val="7"/>
         </w:numPr>
         <w:spacing w:before="240" w:line="276" w:lineRule="auto"/>
         <w:outlineLvl w:val="1"/>
@@ -1646,7 +1646,7 @@
         <w:pStyle w:val="786"/>
         <w:numPr>
           <w:ilvl w:val="0"/>
-          <w:numId w:val="100"/>
+          <w:numId w:val="8"/>
         </w:numPr>
         <w:spacing w:after="80" w:line="264" w:lineRule="auto"/>
       </w:pPr>
@@ -1664,7 +1664,7 @@
         <w:pStyle w:val="786"/>
         <w:numPr>
           <w:ilvl w:val="0"/>
-          <w:numId w:val="100"/>
+          <w:numId w:val="8"/>
         </w:numPr>
         <w:spacing w:after="80" w:line="264" w:lineRule="auto"/>
       </w:pPr>
@@ -1682,7 +1682,7 @@
         <w:pStyle w:val="786"/>
         <w:numPr>
           <w:ilvl w:val="0"/>
-          <w:numId w:val="100"/>
+          <w:numId w:val="8"/>
         </w:numPr>
         <w:spacing w:after="80" w:line="264" w:lineRule="auto"/>
       </w:pPr>
@@ -1714,7 +1714,7 @@
         <w:pStyle w:val="786"/>
         <w:numPr>
           <w:ilvl w:val="0"/>
-          <w:numId w:val="101"/>
+          <w:numId w:val="9"/>
         </w:numPr>
         <w:spacing w:after="80" w:line="264" w:lineRule="auto"/>
       </w:pPr>
@@ -1732,7 +1732,7 @@
         <w:pStyle w:val="786"/>
         <w:numPr>
           <w:ilvl w:val="0"/>
-          <w:numId w:val="101"/>
+          <w:numId w:val="9"/>
         </w:numPr>
         <w:spacing w:after="80" w:line="264" w:lineRule="auto"/>
       </w:pPr>
@@ -1751,7 +1751,7 @@
         <w:pageBreakBefore w:val="0"/>
         <w:numPr>
           <w:ilvl w:val="0"/>
-          <w:numId w:val="92"/>
+          <w:numId w:val="7"/>
         </w:numPr>
         <w:spacing w:before="240" w:line="276" w:lineRule="auto"/>
         <w:outlineLvl w:val="1"/>
@@ -2444,11 +2444,119 @@
     </w:p>
     <w:p>
       <w:pPr>
+        <w:pageBreakBefore w:val="0"/>
+        <w:spacing w:after="120" w:line="264" w:lineRule="auto"/>
+      </w:pPr>
+      <w:r>
+        <w:rPr>
+          <w:sz w:val="20"/>
+          <w:szCs w:val="20"/>
+          <w:rtl w:val="0"/>
+        </w:rPr>
+        <w:t xml:space="preserve">Y los bloques de codigo van en un recuadro, literales y con su sangria:</w:t>
+      </w:r>
+    </w:p>
+    <w:tbl>
+      <w:tblPr>
+        <w:tblW w:w="8770" w:type="dxa"/>
+        <w:tblLayout w:type="fixed"/>
+        <w:tblBorders>
+          <w:top w:val="single" w:sz="4" w:color="BFC7DA"/>
+          <w:left w:val="single" w:sz="4" w:color="BFC7DA"/>
+          <w:bottom w:val="single" w:sz="4" w:color="BFC7DA"/>
+          <w:right w:val="single" w:sz="4" w:color="BFC7DA"/>
+        </w:tblBorders>
+      </w:tblPr>
+      <w:tblGrid>
+        <w:gridCol w:w="8770"/>
+      </w:tblGrid>
+      <w:tr>
+        <w:tc>
+          <w:tcPr>
+            <w:tcW w:w="8770" w:type="dxa"/>
+            <w:shd w:val="clear" w:fill="F3F5F9"/>
+            <w:tcMar>
+              <w:top w:w="80" w:type="dxa"/>
+              <w:bottom w:w="80" w:type="dxa"/>
+              <w:left w:w="120" w:type="dxa"/>
+              <w:right w:w="120" w:type="dxa"/>
+            </w:tcMar>
+          </w:tcPr>
+          <w:p>
+            <w:pPr>
+              <w:spacing w:after="0" w:line="240" w:lineRule="auto"/>
+              <w:jc w:val="left"/>
+            </w:pPr>
+            <w:r>
+              <w:rPr>
+                <w:rFonts w:ascii="Consolas" w:cs="Consolas" w:hAnsi="Consolas"/>
+                <w:sz w:val="16"/>
+                <w:szCs w:val="16"/>
+                <w:rtl w:val="0"/>
+              </w:rPr>
+              <w:t xml:space="preserve">{</w:t>
+            </w:r>
+            <w:r>
+              <w:br/>
+            </w:r>
+            <w:r>
+              <w:rPr>
+                <w:rFonts w:ascii="Consolas" w:cs="Consolas" w:hAnsi="Consolas"/>
+                <w:sz w:val="16"/>
+                <w:szCs w:val="16"/>
+                <w:rtl w:val="0"/>
+              </w:rPr>
+              <w:t xml:space="preserve">  "nombre": "Ana Perez",</w:t>
+            </w:r>
+            <w:r>
+              <w:br/>
+            </w:r>
+            <w:r>
+              <w:rPr>
+                <w:rFonts w:ascii="Consolas" w:cs="Consolas" w:hAnsi="Consolas"/>
+                <w:sz w:val="16"/>
+                <w:szCs w:val="16"/>
+                <w:rtl w:val="0"/>
+              </w:rPr>
+              <w:t xml:space="preserve">  "telefono": "+593998787878"</w:t>
+            </w:r>
+            <w:r>
+              <w:br/>
+            </w:r>
+            <w:r>
+              <w:rPr>
+                <w:rFonts w:ascii="Consolas" w:cs="Consolas" w:hAnsi="Consolas"/>
+                <w:sz w:val="16"/>
+                <w:szCs w:val="16"/>
+                <w:rtl w:val="0"/>
+              </w:rPr>
+              <w:t xml:space="preserve">}</w:t>
+            </w:r>
+          </w:p>
+        </w:tc>
+      </w:tr>
+    </w:tbl>
+    <w:p>
+      <w:pPr>
+        <w:pageBreakBefore w:val="0"/>
+        <w:spacing w:after="40" w:line="264" w:lineRule="auto"/>
+      </w:pPr>
+      <w:r>
+        <w:rPr>
+          <w:sz w:val="8"/>
+          <w:szCs w:val="8"/>
+          <w:rtl w:val="0"/>
+        </w:rPr>
+        <w:t xml:space="preserve"/>
+      </w:r>
+    </w:p>
+    <w:p>
+      <w:pPr>
         <w:pStyle w:val="788"/>
         <w:pageBreakBefore w:val="0"/>
         <w:numPr>
           <w:ilvl w:val="0"/>
-          <w:numId w:val="92"/>
+          <w:numId w:val="7"/>
         </w:numPr>
         <w:spacing w:before="240" w:line="276" w:lineRule="auto"/>
         <w:outlineLvl w:val="1"/>
@@ -2828,7 +2936,7 @@
         <w:pageBreakBefore w:val="0"/>
         <w:numPr>
           <w:ilvl w:val="0"/>
-          <w:numId w:val="92"/>
+          <w:numId w:val="7"/>
         </w:numPr>
         <w:spacing w:before="240" w:line="276" w:lineRule="auto"/>
         <w:outlineLvl w:val="1"/>
@@ -3156,7 +3264,7 @@
         <w:pageBreakBefore w:val="0"/>
         <w:numPr>
           <w:ilvl w:val="0"/>
-          <w:numId w:val="92"/>
+          <w:numId w:val="7"/>
         </w:numPr>
         <w:spacing w:before="240" w:line="276" w:lineRule="auto"/>
         <w:outlineLvl w:val="1"/>
@@ -4913,7 +5021,7 @@
   <w:num w:numId="6">
     <w:abstractNumId w:val="1"/>
   </w:num>
-  <w:abstractNum w:abstractNumId="92">
+  <w:abstractNum w:abstractNumId="6">
     <w:multiLevelType w:val="multilevel"/>
     <w:lvl w:ilvl="0">
       <w:start w:val="1"/>
@@ -4946,16 +5054,16 @@
       </w:pPr>
     </w:lvl>
   </w:abstractNum>
-  <w:num w:numId="92">
-    <w:abstractNumId w:val="92"/>
+  <w:num w:numId="7">
+    <w:abstractNumId w:val="6"/>
   </w:num>
-  <w:num w:numId="100">
+  <w:num w:numId="8">
     <w:abstractNumId w:val="1"/>
     <w:lvlOverride w:ilvl="0">
       <w:startOverride w:val="1"/>
     </w:lvlOverride>
   </w:num>
-  <w:num w:numId="101">
+  <w:num w:numId="9">
     <w:abstractNumId w:val="1"/>
     <w:lvlOverride w:ilvl="0">
       <w:startOverride w:val="1"/>

</xml_diff>